<commit_message>
fix(paper): preserve canonical post-open result layer
</commit_message>
<xml_diff>
--- a/paper/highlights.docx
+++ b/paper/highlights.docx
@@ -367,7 +367,7 @@
           <w:rFonts w:ascii="Calibri" w:hAnsi="Calibri" w:eastAsia="Calibri" w:cs="Calibri"/>
           <w:b w:val="0"/>
         </w:rPr>
-        <w:t>Generates formal statements only from a fully verified one-time receipt.</w:t>
+        <w:t>Generates the five comparison statements only from a fully verified one-time receipt.</w:t>
       </w:r>
     </w:p>
     <w:p>
@@ -404,7 +404,7 @@
           <w:rFonts w:ascii="Calibri" w:hAnsi="Calibri" w:eastAsia="Calibri" w:cs="Calibri"/>
           <w:b w:val="0"/>
         </w:rPr>
-        <w:t>The legacy headline numbers have been withdrawn because they belong to a different station mapping and do not have the lineage sidecars required by the current code. The 2018–2020 predictor-product bridge has passed. The outstanding work is to rerun the canonical development chain, freeze and replay all model bundles, acquire the remaining outcome-free metadata and historical covariates in the required order, pass authorization, execute the fixed opening, receipt-bind the coverage audit, and regenerate the manuscript and release evidence.</w:t>
+        <w:t>The legacy headline numbers have been withdrawn because they belong to a different station mapping and do not have the lineage sidecars required by the current code. The 2018–2020 predictor-product bridge has passed. The outstanding work is to rerun the canonical development chain, freeze and replay all model bundles, acquire the remaining outcome-free metadata and historical covariates in the required order, pass authorization, execute the fixed opening, receipt-bind the coverage audit, and generate the canonical Markdown result layer and release evidence.</w:t>
       </w:r>
     </w:p>
     <w:p>

</xml_diff>